<commit_message>
fix: harden uploads and sessions, support offline snooze and school periods
</commit_message>
<xml_diff>
--- a/docs/参赛资料/拾日软件设计资料初稿.docx
+++ b/docs/参赛资料/拾日软件设计资料初稿.docx
@@ -12,7 +12,7 @@
     </w:p>
     <w:p>
       <w:r>
-        <w:t>版本：1.0.0+8。本文根据当前项目代码编写，介绍软件要解决的问题、主要功能、程序结构和数据处理方式。</w:t>
+        <w:t>版本：1.0.0+9。本文根据当前项目代码编写，介绍软件要解决的问题、主要功能、程序结构和数据处理方式。</w:t>
       </w:r>
     </w:p>
     <w:p>
@@ -1137,7 +1137,7 @@
       <w:jc w:val="right"/>
     </w:pPr>
     <w:r>
-      <w:t xml:space="preserve">1.0.0+8  ·  </w:t>
+      <w:t xml:space="preserve">1.0.0+9  ·  </w:t>
     </w:r>
     <w:fldSimple w:instr="PAGE"/>
   </w:p>

</xml_diff>